<commit_message>
Integrate Ecopetrol templates, API 581 Add.1 s8, PCC-3: Df engine (Eqs 2.12-2.20), Ecopetrol RAM matrix, corrected POF location and alpha answer
Co-Authored-By: Claude Sonnet 5.5 <noreply@anthropic.com>
Claude-Session: https://claude.ai/code/session_014T3x3vbmLmpBHxXp5vGwhE
</commit_message>
<xml_diff>
--- a/Barrancabermeja_RBI/Informe_RBI_Barrancabermeja_5p.docx
+++ b/Barrancabermeja_RBI/Informe_RBI_Barrancabermeja_5p.docx
@@ -78,7 +78,7 @@
         <w:spacing w:after="10"/>
       </w:pPr>
       <w:r>
-        <w:t>Ubicación en API 581: las tablas 15.2M y 16.2M que cita el paper indican Parte 2 §15 (corrosión externa) y §16 (CUI); el encargo dice §16 y §17. Verificar. ASME PCC-3 es planificación de inspección; la reparación es PCC-2. El paper no enumera "12 pasos" de COF.</w:t>
+        <w:t>Adjuntos analizados. API 581 Adenda 1 (2019) Parte 1 §8: módulo de haces de intercambiadores con la decisión económica inspeccionar/reemplazar (Eqs. 1.78–1.80). ASME PCC-3-2022: secciones 7–10 y continuum verificados; no trae POF ni VAN. Plantilla Ecopetrol STAP: implementa API 581 con numeración (POF Parte 1 Eq. 1.1; Df Eqs. 2.12–2.20; Tablas 4.5/4.6; GFF Tabla 3.1). Plantilla VRS: matriz RAM Ecopetrol N/L/M/H/VH, costos y plan. Corrijo: POF está en Parte 1, no Parte 2; el §15/§16 del paper vs §16/§17 del encargo sigue sin verificar; ASME PCC-3 es inspección, la reparación es PCC-2.</w:t>
       </w:r>
     </w:p>
     <w:p>
@@ -629,7 +629,7 @@
         </w:tc>
         <w:tc>
           <w:tcPr>
-            <w:tcW w:type="dxa" w:w="2948"/>
+            <w:tcW w:type="dxa" w:w="3005"/>
             <w:shd w:val="clear" w:color="auto" w:fill="1F3864"/>
           </w:tcPr>
           <w:p>
@@ -661,13 +661,13 @@
                 <w:color w:val="FFFFFF"/>
                 <w:sz w:val="16"/>
               </w:rPr>
-              <w:t>PCC-3 (§7–10 según el encargo)</w:t>
-            </w:r>
-          </w:p>
-        </w:tc>
-        <w:tc>
-          <w:tcPr>
-            <w:tcW w:type="dxa" w:w="1928"/>
+              <w:t>PCC-3-2022 (leído)</w:t>
+            </w:r>
+          </w:p>
+        </w:tc>
+        <w:tc>
+          <w:tcPr>
+            <w:tcW w:type="dxa" w:w="1701"/>
             <w:shd w:val="clear" w:color="auto" w:fill="1F3864"/>
           </w:tcPr>
           <w:p>
@@ -686,7 +686,7 @@
         </w:tc>
         <w:tc>
           <w:tcPr>
-            <w:tcW w:type="dxa" w:w="1644"/>
+            <w:tcW w:type="dxa" w:w="2041"/>
             <w:shd w:val="clear" w:color="auto" w:fill="1F3864"/>
           </w:tcPr>
           <w:p>
@@ -723,7 +723,7 @@
         </w:tc>
         <w:tc>
           <w:tcPr>
-            <w:tcW w:type="dxa" w:w="2948"/>
+            <w:tcW w:type="dxa" w:w="3005"/>
           </w:tcPr>
           <w:p>
             <w:pPr>
@@ -733,7 +733,7 @@
               <w:rPr>
                 <w:sz w:val="16"/>
               </w:rPr>
-              <w:t>Parte 1; risk target (Oropallo p.7)</w:t>
+              <w:t>Parte 1 (risk target; Oropallo p.7)</w:t>
             </w:r>
           </w:p>
         </w:tc>
@@ -749,13 +749,13 @@
               <w:rPr>
                 <w:sz w:val="16"/>
               </w:rPr>
-              <w:t>Planificación y gestión del riesgo con inspección</w:t>
-            </w:r>
-          </w:p>
-        </w:tc>
-        <w:tc>
-          <w:tcPr>
-            <w:tcW w:type="dxa" w:w="1928"/>
+              <w:t>§3 continuum; §4 planificación</w:t>
+            </w:r>
+          </w:p>
+        </w:tc>
+        <w:tc>
+          <w:tcPr>
+            <w:tcW w:type="dxa" w:w="1701"/>
           </w:tcPr>
           <w:p>
             <w:pPr>
@@ -771,7 +771,7 @@
         </w:tc>
         <w:tc>
           <w:tcPr>
-            <w:tcW w:type="dxa" w:w="1644"/>
+            <w:tcW w:type="dxa" w:w="2041"/>
           </w:tcPr>
           <w:p>
             <w:pPr>
@@ -781,7 +781,7 @@
               <w:rPr>
                 <w:sz w:val="16"/>
               </w:rPr>
-              <w:t>Secciones PENDIENTE</w:t>
+              <w:t>Paper y PCC-3 verificados</w:t>
             </w:r>
           </w:p>
         </w:tc>
@@ -805,7 +805,7 @@
         </w:tc>
         <w:tc>
           <w:tcPr>
-            <w:tcW w:type="dxa" w:w="2948"/>
+            <w:tcW w:type="dxa" w:w="3005"/>
           </w:tcPr>
           <w:p>
             <w:pPr>
@@ -815,7 +815,7 @@
               <w:rPr>
                 <w:sz w:val="16"/>
               </w:rPr>
-              <w:t>Parte 2, POF=gff·Df·FMS; Tabla 3.1; Anexo 2.A</w:t>
+              <w:t>Parte 1 Eq. 1.1: POF=Df·gff·FMS; Tabla 3.1 (gff); Anexo 2.A (FMS)</w:t>
             </w:r>
           </w:p>
         </w:tc>
@@ -831,13 +831,13 @@
               <w:rPr>
                 <w:sz w:val="16"/>
               </w:rPr>
-              <w:t>—</w:t>
-            </w:r>
-          </w:p>
-        </w:tc>
-        <w:tc>
-          <w:tcPr>
-            <w:tcW w:type="dxa" w:w="1928"/>
+              <w:t>§7 (categorías de 3 y 6 niveles); sin ecuaciones</w:t>
+            </w:r>
+          </w:p>
+        </w:tc>
+        <w:tc>
+          <w:tcPr>
+            <w:tcW w:type="dxa" w:w="1701"/>
           </w:tcPr>
           <w:p>
             <w:pPr>
@@ -853,7 +853,7 @@
         </w:tc>
         <w:tc>
           <w:tcPr>
-            <w:tcW w:type="dxa" w:w="1644"/>
+            <w:tcW w:type="dxa" w:w="2041"/>
           </w:tcPr>
           <w:p>
             <w:pPr>
@@ -863,7 +863,7 @@
               <w:rPr>
                 <w:sz w:val="16"/>
               </w:rPr>
-              <w:t>Eq. 1 verificada en paper</w:t>
+              <w:t>Eq. 1.1 y Tabla 3.1 verificadas en plantilla STAP</w:t>
             </w:r>
           </w:p>
         </w:tc>
@@ -887,7 +887,7 @@
         </w:tc>
         <w:tc>
           <w:tcPr>
-            <w:tcW w:type="dxa" w:w="2948"/>
+            <w:tcW w:type="dxa" w:w="3005"/>
           </w:tcPr>
           <w:p>
             <w:pPr>
@@ -897,7 +897,7 @@
               <w:rPr>
                 <w:sz w:val="16"/>
               </w:rPr>
-              <w:t>§4 adelgazamiento; §15–16 externa/CUI (por tablas del paper)</w:t>
+              <w:t>Parte 2 §4 adelgazamiento, Eqs. 2.12–2.20, Tablas 4.5/4.6; ext./CUI Tabla 15.2 y 16.x</w:t>
             </w:r>
           </w:p>
         </w:tc>
@@ -913,13 +913,13 @@
               <w:rPr>
                 <w:sz w:val="16"/>
               </w:rPr>
-              <w:t>Idoneidad de NDE por mecanismo</w:t>
-            </w:r>
-          </w:p>
-        </w:tc>
-        <w:tc>
-          <w:tcPr>
-            <w:tcW w:type="dxa" w:w="1928"/>
+              <w:t>§6 mecanismos; Apéndice A–B</w:t>
+            </w:r>
+          </w:p>
+        </w:tc>
+        <w:tc>
+          <w:tcPr>
+            <w:tcW w:type="dxa" w:w="1701"/>
           </w:tcPr>
           <w:p>
             <w:pPr>
@@ -935,7 +935,7 @@
         </w:tc>
         <w:tc>
           <w:tcPr>
-            <w:tcW w:type="dxa" w:w="1644"/>
+            <w:tcW w:type="dxa" w:w="2041"/>
           </w:tcPr>
           <w:p>
             <w:pPr>
@@ -945,7 +945,7 @@
               <w:rPr>
                 <w:sz w:val="16"/>
               </w:rPr>
-              <w:t>Numeración: verificar</w:t>
+              <w:t>Verificado en plantilla; texto de la norma PENDIENTE</w:t>
             </w:r>
           </w:p>
         </w:tc>
@@ -963,13 +963,13 @@
               <w:rPr>
                 <w:sz w:val="16"/>
               </w:rPr>
-              <w:t>Efectividad NDE</w:t>
-            </w:r>
-          </w:p>
-        </w:tc>
-        <w:tc>
-          <w:tcPr>
-            <w:tcW w:type="dxa" w:w="2948"/>
+              <w:t>NDE</w:t>
+            </w:r>
+          </w:p>
+        </w:tc>
+        <w:tc>
+          <w:tcPr>
+            <w:tcW w:type="dxa" w:w="3005"/>
           </w:tcPr>
           <w:p>
             <w:pPr>
@@ -979,7 +979,7 @@
               <w:rPr>
                 <w:sz w:val="16"/>
               </w:rPr>
-              <w:t>Tablas A–E por mecanismo (Oropallo Tabla 1, Eq. 7)</w:t>
+              <w:t>Eqs. 2.16–2.19 (Bayes, efectividad A–E)</w:t>
             </w:r>
           </w:p>
         </w:tc>
@@ -995,13 +995,13 @@
               <w:rPr>
                 <w:sz w:val="16"/>
               </w:rPr>
-              <w:t>Actividades de inspección</w:t>
-            </w:r>
-          </w:p>
-        </w:tc>
-        <w:tc>
-          <w:tcPr>
-            <w:tcW w:type="dxa" w:w="1928"/>
+              <w:t>§10.1: reduce incertidumbre, no el daño</w:t>
+            </w:r>
+          </w:p>
+        </w:tc>
+        <w:tc>
+          <w:tcPr>
+            <w:tcW w:type="dxa" w:w="1701"/>
           </w:tcPr>
           <w:p>
             <w:pPr>
@@ -1017,7 +1017,7 @@
         </w:tc>
         <w:tc>
           <w:tcPr>
-            <w:tcW w:type="dxa" w:w="1644"/>
+            <w:tcW w:type="dxa" w:w="2041"/>
           </w:tcPr>
           <w:p>
             <w:pPr>
@@ -1027,7 +1027,7 @@
               <w:rPr>
                 <w:sz w:val="16"/>
               </w:rPr>
-              <w:t>Tablas PENDIENTE</w:t>
+              <w:t>Verificado en plantilla</w:t>
             </w:r>
           </w:p>
         </w:tc>
@@ -1051,7 +1051,7 @@
         </w:tc>
         <w:tc>
           <w:tcPr>
-            <w:tcW w:type="dxa" w:w="2948"/>
+            <w:tcW w:type="dxa" w:w="3005"/>
           </w:tcPr>
           <w:p>
             <w:pPr>
@@ -1061,7 +1061,7 @@
               <w:rPr>
                 <w:sz w:val="16"/>
               </w:rPr>
-              <w:t>Parte 3; Eqs. 9–13; matriz Parte 1</w:t>
+              <w:t>Parte 3; Eqs. 9–13 del paper; Parte 1 Figs. 4.2–4.3</w:t>
             </w:r>
           </w:p>
         </w:tc>
@@ -1077,13 +1077,13 @@
               <w:rPr>
                 <w:sz w:val="16"/>
               </w:rPr>
-              <w:t>Matriz de ejemplo</w:t>
-            </w:r>
-          </w:p>
-        </w:tc>
-        <w:tc>
-          <w:tcPr>
-            <w:tcW w:type="dxa" w:w="1928"/>
+              <w:t>§8 (§8.3.7.1.1 costo de oportunidad); §9.5.1 matriz de ejemplo</w:t>
+            </w:r>
+          </w:p>
+        </w:tc>
+        <w:tc>
+          <w:tcPr>
+            <w:tcW w:type="dxa" w:w="1701"/>
           </w:tcPr>
           <w:p>
             <w:pPr>
@@ -1093,13 +1093,13 @@
               <w:rPr>
                 <w:sz w:val="16"/>
               </w:rPr>
-              <w:t>—</w:t>
-            </w:r>
-          </w:p>
-        </w:tc>
-        <w:tc>
-          <w:tcPr>
-            <w:tcW w:type="dxa" w:w="1644"/>
+              <w:t>Matriz Ecopetrol (VRS)</w:t>
+            </w:r>
+          </w:p>
+        </w:tc>
+        <w:tc>
+          <w:tcPr>
+            <w:tcW w:type="dxa" w:w="2041"/>
           </w:tcPr>
           <w:p>
             <w:pPr>
@@ -1109,7 +1109,7 @@
               <w:rPr>
                 <w:sz w:val="16"/>
               </w:rPr>
-              <w:t>Fig. 5 verificada</w:t>
+              <w:t>Verificado</w:t>
             </w:r>
           </w:p>
         </w:tc>
@@ -1127,13 +1127,13 @@
               <w:rPr>
                 <w:sz w:val="16"/>
               </w:rPr>
-              <w:t>Exceso de riesgo</w:t>
-            </w:r>
-          </w:p>
-        </w:tc>
-        <w:tc>
-          <w:tcPr>
-            <w:tcW w:type="dxa" w:w="2948"/>
+              <w:t>Decisión económica</w:t>
+            </w:r>
+          </w:p>
+        </w:tc>
+        <w:tc>
+          <w:tcPr>
+            <w:tcW w:type="dxa" w:w="3005"/>
           </w:tcPr>
           <w:p>
             <w:pPr>
@@ -1143,7 +1143,7 @@
               <w:rPr>
                 <w:sz w:val="16"/>
               </w:rPr>
-              <w:t>—</w:t>
+              <w:t>Parte 1 §8.7: EIR Eq. 1.78; reglas 1.79–1.80 (haces)</w:t>
             </w:r>
           </w:p>
         </w:tc>
@@ -1159,13 +1159,13 @@
               <w:rPr>
                 <w:sz w:val="16"/>
               </w:rPr>
-              <w:t>Reparación: PCC-2</w:t>
-            </w:r>
-          </w:p>
-        </w:tc>
-        <w:tc>
-          <w:tcPr>
-            <w:tcW w:type="dxa" w:w="1928"/>
+              <w:t>§9.5.3 gráfico NPVS</w:t>
+            </w:r>
+          </w:p>
+        </w:tc>
+        <w:tc>
+          <w:tcPr>
+            <w:tcW w:type="dxa" w:w="1701"/>
           </w:tcPr>
           <w:p>
             <w:pPr>
@@ -1175,13 +1175,13 @@
               <w:rPr>
                 <w:sz w:val="16"/>
               </w:rPr>
-              <w:t>FFS Niveles 1–3</w:t>
-            </w:r>
-          </w:p>
-        </w:tc>
-        <w:tc>
-          <w:tcPr>
-            <w:tcW w:type="dxa" w:w="1644"/>
+              <w:t>ISO 15663</w:t>
+            </w:r>
+          </w:p>
+        </w:tc>
+        <w:tc>
+          <w:tcPr>
+            <w:tcW w:type="dxa" w:w="2041"/>
           </w:tcPr>
           <w:p>
             <w:pPr>
@@ -1191,7 +1191,7 @@
               <w:rPr>
                 <w:sz w:val="16"/>
               </w:rPr>
-              <w:t>PENDIENTE</w:t>
+              <w:t>Verificado (haces)</w:t>
             </w:r>
           </w:p>
         </w:tc>
@@ -1209,13 +1209,13 @@
               <w:rPr>
                 <w:sz w:val="16"/>
               </w:rPr>
-              <w:t>Economía</w:t>
-            </w:r>
-          </w:p>
-        </w:tc>
-        <w:tc>
-          <w:tcPr>
-            <w:tcW w:type="dxa" w:w="2948"/>
+              <w:t>Exceso de riesgo</w:t>
+            </w:r>
+          </w:p>
+        </w:tc>
+        <w:tc>
+          <w:tcPr>
+            <w:tcW w:type="dxa" w:w="3005"/>
           </w:tcPr>
           <w:p>
             <w:pPr>
@@ -1241,13 +1241,13 @@
               <w:rPr>
                 <w:sz w:val="16"/>
               </w:rPr>
-              <w:t>—</w:t>
-            </w:r>
-          </w:p>
-        </w:tc>
-        <w:tc>
-          <w:tcPr>
-            <w:tcW w:type="dxa" w:w="1928"/>
+              <w:t>Reparación: PCC-2</w:t>
+            </w:r>
+          </w:p>
+        </w:tc>
+        <w:tc>
+          <w:tcPr>
+            <w:tcW w:type="dxa" w:w="1701"/>
           </w:tcPr>
           <w:p>
             <w:pPr>
@@ -1257,13 +1257,13 @@
               <w:rPr>
                 <w:sz w:val="16"/>
               </w:rPr>
-              <w:t>ISO 15663, ISO/TS 55010</w:t>
-            </w:r>
-          </w:p>
-        </w:tc>
-        <w:tc>
-          <w:tcPr>
-            <w:tcW w:type="dxa" w:w="1644"/>
+              <w:t>FFS Niveles 1–3</w:t>
+            </w:r>
+          </w:p>
+        </w:tc>
+        <w:tc>
+          <w:tcPr>
+            <w:tcW w:type="dxa" w:w="2041"/>
           </w:tcPr>
           <w:p>
             <w:pPr>
@@ -1273,7 +1273,7 @@
               <w:rPr>
                 <w:sz w:val="16"/>
               </w:rPr>
-              <w:t>Modelo propio</w:t>
+              <w:t>PENDIENTE</w:t>
             </w:r>
           </w:p>
         </w:tc>
@@ -1309,7 +1309,358 @@
           <w:color w:val="1F3864"/>
           <w:sz w:val="23"/>
         </w:rPr>
-        <w:t>5. Ejemplo numérico (caso del paper, TBI vs RBI-2 intrusiva)</w:t>
+        <w:t>5. Motor Df de API 581 (Parte 2) y efecto de la NDE</w:t>
+      </w:r>
+    </w:p>
+    <w:p>
+      <w:r>
+        <w:rPr>
+          <w:b w:val="0"/>
+          <w:i w:val="0"/>
+        </w:rPr>
+        <w:t>Eqs. (plantilla STAP, 3.ª ed.): Art=Cr·age/t_rd (2.12) · FS=(YS+TS)/2·E·1,1 (2.13) · SR_P=S·E·t_min/(FS·t_rd) (2.14) · I_k=Pr_k·ΠCo_k^n (2.16) · Po_k=I_k/ΣI (2.17) · β_k=(1−Ds_k·Art−SR_P)/√(Ds_k²Art²COV_Δt²+(1−Ds_k·Art)²COV_Sf²+SR_P²COV_P²), Ds=1,2,4, COV=0,2/0,2/0,05 (2.18) · Df_B=ΣPo_k·Φ(−β_k)/1,56·10⁻⁴ (2.19) · Df=max[Df_B·F_IP·F_DL/F_OM; 0,1] (2.20). Priors Tabla 4.5 (media 0,7/0,2/0,1); Co Tabla 4.6 (A 0,9/0,09/0,01 · B 0,7/0,2/0,1 · C 0,5/0,3/0,2 · D 0,4/0,33/0,27). α no aparece: es de Oropallo Eq. 6.</w:t>
+      </w:r>
+    </w:p>
+    <w:tbl>
+      <w:tblPr>
+        <w:tblStyle w:val="TableGrid"/>
+        <w:tblW w:type="auto" w:w="0"/>
+        <w:tblLook w:firstColumn="1" w:firstRow="1" w:lastColumn="0" w:lastRow="0" w:noHBand="0" w:noVBand="1" w:val="04A0"/>
+      </w:tblPr>
+      <w:tblGrid>
+        <w:gridCol w:w="1757"/>
+        <w:gridCol w:w="1757"/>
+        <w:gridCol w:w="1757"/>
+        <w:gridCol w:w="1757"/>
+        <w:gridCol w:w="1757"/>
+        <w:gridCol w:w="1757"/>
+      </w:tblGrid>
+      <w:tr>
+        <w:tc>
+          <w:tcPr>
+            <w:tcW w:type="dxa" w:w="4762"/>
+            <w:shd w:val="clear" w:color="auto" w:fill="1F3864"/>
+          </w:tcPr>
+          <w:p>
+            <w:pPr>
+              <w:spacing w:after="0"/>
+            </w:pPr>
+            <w:r>
+              <w:rPr>
+                <w:b/>
+                <w:color w:val="FFFFFF"/>
+                <w:sz w:val="16"/>
+              </w:rPr>
+              <w:t>Datos del paper + t_min=4 mm (supuesto)</w:t>
+            </w:r>
+          </w:p>
+        </w:tc>
+        <w:tc>
+          <w:tcPr>
+            <w:tcW w:type="dxa" w:w="1247"/>
+            <w:shd w:val="clear" w:color="auto" w:fill="1F3864"/>
+          </w:tcPr>
+          <w:p>
+            <w:pPr>
+              <w:spacing w:after="0"/>
+            </w:pPr>
+            <w:r>
+              <w:rPr>
+                <w:b/>
+                <w:color w:val="FFFFFF"/>
+                <w:sz w:val="16"/>
+              </w:rPr>
+              <w:t>Sin insp.</w:t>
+            </w:r>
+          </w:p>
+        </w:tc>
+        <w:tc>
+          <w:tcPr>
+            <w:tcW w:type="dxa" w:w="850"/>
+            <w:shd w:val="clear" w:color="auto" w:fill="1F3864"/>
+          </w:tcPr>
+          <w:p>
+            <w:pPr>
+              <w:spacing w:after="0"/>
+            </w:pPr>
+            <w:r>
+              <w:rPr>
+                <w:b/>
+                <w:color w:val="FFFFFF"/>
+                <w:sz w:val="16"/>
+              </w:rPr>
+              <w:t>D</w:t>
+            </w:r>
+          </w:p>
+        </w:tc>
+        <w:tc>
+          <w:tcPr>
+            <w:tcW w:type="dxa" w:w="850"/>
+            <w:shd w:val="clear" w:color="auto" w:fill="1F3864"/>
+          </w:tcPr>
+          <w:p>
+            <w:pPr>
+              <w:spacing w:after="0"/>
+            </w:pPr>
+            <w:r>
+              <w:rPr>
+                <w:b/>
+                <w:color w:val="FFFFFF"/>
+                <w:sz w:val="16"/>
+              </w:rPr>
+              <w:t>C</w:t>
+            </w:r>
+          </w:p>
+        </w:tc>
+        <w:tc>
+          <w:tcPr>
+            <w:tcW w:type="dxa" w:w="850"/>
+            <w:shd w:val="clear" w:color="auto" w:fill="1F3864"/>
+          </w:tcPr>
+          <w:p>
+            <w:pPr>
+              <w:spacing w:after="0"/>
+            </w:pPr>
+            <w:r>
+              <w:rPr>
+                <w:b/>
+                <w:color w:val="FFFFFF"/>
+                <w:sz w:val="16"/>
+              </w:rPr>
+              <w:t>B</w:t>
+            </w:r>
+          </w:p>
+        </w:tc>
+        <w:tc>
+          <w:tcPr>
+            <w:tcW w:type="dxa" w:w="850"/>
+            <w:shd w:val="clear" w:color="auto" w:fill="1F3864"/>
+          </w:tcPr>
+          <w:p>
+            <w:pPr>
+              <w:spacing w:after="0"/>
+            </w:pPr>
+            <w:r>
+              <w:rPr>
+                <w:b/>
+                <w:color w:val="FFFFFF"/>
+                <w:sz w:val="16"/>
+              </w:rPr>
+              <w:t>A</w:t>
+            </w:r>
+          </w:p>
+        </w:tc>
+      </w:tr>
+      <w:tr>
+        <w:tc>
+          <w:tcPr>
+            <w:tcW w:type="dxa" w:w="4762"/>
+          </w:tcPr>
+          <w:p>
+            <w:pPr>
+              <w:spacing w:after="0"/>
+            </w:pPr>
+            <w:r>
+              <w:rPr>
+                <w:sz w:val="16"/>
+              </w:rPr>
+              <w:t>Df CUI en 2027 (Cr 0,127 mm/a, t_rd 8,3 mm de 2018)</w:t>
+            </w:r>
+          </w:p>
+        </w:tc>
+        <w:tc>
+          <w:tcPr>
+            <w:tcW w:type="dxa" w:w="1247"/>
+          </w:tcPr>
+          <w:p>
+            <w:pPr>
+              <w:spacing w:after="0"/>
+            </w:pPr>
+            <w:r>
+              <w:rPr>
+                <w:sz w:val="16"/>
+              </w:rPr>
+              <w:t>27,4</w:t>
+            </w:r>
+          </w:p>
+        </w:tc>
+        <w:tc>
+          <w:tcPr>
+            <w:tcW w:type="dxa" w:w="850"/>
+          </w:tcPr>
+          <w:p>
+            <w:pPr>
+              <w:spacing w:after="0"/>
+            </w:pPr>
+            <w:r>
+              <w:rPr>
+                <w:sz w:val="16"/>
+              </w:rPr>
+              <w:t>20,0</w:t>
+            </w:r>
+          </w:p>
+        </w:tc>
+        <w:tc>
+          <w:tcPr>
+            <w:tcW w:type="dxa" w:w="850"/>
+          </w:tcPr>
+          <w:p>
+            <w:pPr>
+              <w:spacing w:after="0"/>
+            </w:pPr>
+            <w:r>
+              <w:rPr>
+                <w:sz w:val="16"/>
+              </w:rPr>
+              <w:t>13,1</w:t>
+            </w:r>
+          </w:p>
+        </w:tc>
+        <w:tc>
+          <w:tcPr>
+            <w:tcW w:type="dxa" w:w="850"/>
+          </w:tcPr>
+          <w:p>
+            <w:pPr>
+              <w:spacing w:after="0"/>
+            </w:pPr>
+            <w:r>
+              <w:rPr>
+                <w:sz w:val="16"/>
+              </w:rPr>
+              <w:t>5,6</w:t>
+            </w:r>
+          </w:p>
+        </w:tc>
+        <w:tc>
+          <w:tcPr>
+            <w:tcW w:type="dxa" w:w="850"/>
+          </w:tcPr>
+          <w:p>
+            <w:pPr>
+              <w:spacing w:after="0"/>
+            </w:pPr>
+            <w:r>
+              <w:rPr>
+                <w:sz w:val="16"/>
+              </w:rPr>
+              <w:t>1,0</w:t>
+            </w:r>
+          </w:p>
+        </w:tc>
+      </w:tr>
+      <w:tr>
+        <w:tc>
+          <w:tcPr>
+            <w:tcW w:type="dxa" w:w="4762"/>
+          </w:tcPr>
+          <w:p>
+            <w:pPr>
+              <w:spacing w:after="0"/>
+            </w:pPr>
+            <w:r>
+              <w:rPr>
+                <w:sz w:val="16"/>
+              </w:rPr>
+              <w:t>Df 2023: adelgazamiento / CUI (categoría 1 = 1C)</w:t>
+            </w:r>
+          </w:p>
+        </w:tc>
+        <w:tc>
+          <w:tcPr>
+            <w:tcW w:type="dxa" w:w="1247"/>
+          </w:tcPr>
+          <w:p>
+            <w:pPr>
+              <w:spacing w:after="0"/>
+            </w:pPr>
+            <w:r>
+              <w:rPr>
+                <w:sz w:val="16"/>
+              </w:rPr>
+              <w:t>0,28 / 0,73</w:t>
+            </w:r>
+          </w:p>
+        </w:tc>
+        <w:tc>
+          <w:tcPr>
+            <w:tcW w:type="dxa" w:w="850"/>
+          </w:tcPr>
+          <w:p>
+            <w:pPr>
+              <w:spacing w:after="0"/>
+            </w:pPr>
+            <w:r>
+              <w:rPr>
+                <w:sz w:val="16"/>
+              </w:rPr>
+            </w:r>
+          </w:p>
+        </w:tc>
+        <w:tc>
+          <w:tcPr>
+            <w:tcW w:type="dxa" w:w="850"/>
+          </w:tcPr>
+          <w:p>
+            <w:pPr>
+              <w:spacing w:after="0"/>
+            </w:pPr>
+            <w:r>
+              <w:rPr>
+                <w:sz w:val="16"/>
+              </w:rPr>
+            </w:r>
+          </w:p>
+        </w:tc>
+        <w:tc>
+          <w:tcPr>
+            <w:tcW w:type="dxa" w:w="850"/>
+          </w:tcPr>
+          <w:p>
+            <w:pPr>
+              <w:spacing w:after="0"/>
+            </w:pPr>
+            <w:r>
+              <w:rPr>
+                <w:sz w:val="16"/>
+              </w:rPr>
+            </w:r>
+          </w:p>
+        </w:tc>
+        <w:tc>
+          <w:tcPr>
+            <w:tcW w:type="dxa" w:w="850"/>
+          </w:tcPr>
+          <w:p>
+            <w:pPr>
+              <w:spacing w:after="0"/>
+            </w:pPr>
+            <w:r>
+              <w:rPr>
+                <w:sz w:val="16"/>
+              </w:rPr>
+            </w:r>
+          </w:p>
+        </w:tc>
+      </w:tr>
+    </w:tbl>
+    <w:p>
+      <w:pPr>
+        <w:spacing w:after="0"/>
+      </w:pPr>
+    </w:p>
+    <w:p>
+      <w:pPr>
+        <w:keepNext/>
+        <w:spacing w:before="80" w:after="30"/>
+      </w:pPr>
+      <w:r>
+        <w:rPr>
+          <w:b/>
+          <w:color w:val="1F3864"/>
+          <w:sz w:val="23"/>
+        </w:rPr>
+        <w:t>6. Ejemplo numérico (caso del paper, TBI vs RBI-2 intrusiva)</w:t>
       </w:r>
     </w:p>
     <w:tbl>
@@ -3607,7 +3958,7 @@
           <w:color w:val="1F3864"/>
           <w:sz w:val="23"/>
         </w:rPr>
-        <w:t>6. Matriz RAM antes y después (riesgo cualitativo y $)</w:t>
+        <w:t>7. Matriz RAM Ecopetrol antes y después (riesgo cualitativo y $)</w:t>
       </w:r>
     </w:p>
     <w:tbl>
@@ -3913,7 +4264,7 @@
               <w:rPr>
                 <w:sz w:val="16"/>
               </w:rPr>
-              <w:t>B</w:t>
+              <w:t>N</w:t>
             </w:r>
           </w:p>
         </w:tc>
@@ -4075,7 +4426,7 @@
               <w:rPr>
                 <w:sz w:val="16"/>
               </w:rPr>
-              <w:t>MA</w:t>
+              <w:t>M</w:t>
             </w:r>
           </w:p>
         </w:tc>
@@ -4237,7 +4588,7 @@
               <w:rPr>
                 <w:sz w:val="16"/>
               </w:rPr>
-              <w:t>B</w:t>
+              <w:t>L</w:t>
             </w:r>
           </w:p>
         </w:tc>
@@ -4399,7 +4750,7 @@
               <w:rPr>
                 <w:sz w:val="16"/>
               </w:rPr>
-              <w:t>B</w:t>
+              <w:t>N</w:t>
             </w:r>
           </w:p>
         </w:tc>
@@ -4561,7 +4912,7 @@
               <w:rPr>
                 <w:sz w:val="16"/>
               </w:rPr>
-              <w:t>B</w:t>
+              <w:t>L</w:t>
             </w:r>
           </w:p>
         </w:tc>
@@ -4723,7 +5074,7 @@
               <w:rPr>
                 <w:sz w:val="16"/>
               </w:rPr>
-              <w:t>B</w:t>
+              <w:t>N</w:t>
             </w:r>
           </w:p>
         </w:tc>
@@ -4804,7 +5155,7 @@
           <w:b w:val="0"/>
           <w:i w:val="0"/>
         </w:rPr>
-        <w:t>Lectura: sin inspección el equipo pasa de 1C a 4C (Medio-alto, excede el target medio). RBI lo devuelve a 1C (−3 categorías, −2 niveles); un FFS apto lo lleva a 2C. En $, el riesgo evitado es de ~500 $/año: menos que el costo del FFS (15.000 $). Con consecuencia C, la acción se justifica por cumplir el target y por seguridad, no por ahorro de riesgo. La matriz es provisional (suma de índices P+C), anclada en dos datos del paper: 1C ≤ medio y 3C = límite.</w:t>
+        <w:t>Lectura: sin inspección el equipo pasa de 1C (N) a 4C (M en la matriz Ecopetrol; la matriz API del paper lo excedería). RBI lo devuelve a 1C (−3 categorías, −2 niveles); un FFS apto lo lleva a 2C (L). En $, el riesgo evitado es de ~500 $/año: menos que el costo del FFS (15.000 $). Con consecuencia C, la acción se justifica por cumplir el target y por seguridad, no por ahorro de riesgo. La matriz es la corporativa de Ecopetrol (plantilla VRS); las categorías de probabilidad usan rangos de Df de memoria (PENDIENTE).</w:t>
       </w:r>
     </w:p>
     <w:p>
@@ -4818,7 +5169,7 @@
           <w:color w:val="1F3864"/>
           <w:sz w:val="23"/>
         </w:rPr>
-        <w:t>7. Validación contra Oropallo</w:t>
+        <w:t>8. Validación contra Oropallo</w:t>
       </w:r>
     </w:p>
     <w:tbl>
@@ -4836,7 +5187,7 @@
       <w:tr>
         <w:tc>
           <w:tcPr>
-            <w:tcW w:type="dxa" w:w="3628"/>
+            <w:tcW w:type="dxa" w:w="3742"/>
             <w:shd w:val="clear" w:color="auto" w:fill="1F3864"/>
           </w:tcPr>
           <w:p>
@@ -4855,7 +5206,7 @@
         </w:tc>
         <w:tc>
           <w:tcPr>
-            <w:tcW w:type="dxa" w:w="2268"/>
+            <w:tcW w:type="dxa" w:w="1928"/>
             <w:shd w:val="clear" w:color="auto" w:fill="1F3864"/>
           </w:tcPr>
           <w:p>
@@ -4874,7 +5225,7 @@
         </w:tc>
         <w:tc>
           <w:tcPr>
-            <w:tcW w:type="dxa" w:w="2041"/>
+            <w:tcW w:type="dxa" w:w="1871"/>
             <w:shd w:val="clear" w:color="auto" w:fill="1F3864"/>
           </w:tcPr>
           <w:p>
@@ -4893,7 +5244,7 @@
         </w:tc>
         <w:tc>
           <w:tcPr>
-            <w:tcW w:type="dxa" w:w="2551"/>
+            <w:tcW w:type="dxa" w:w="2948"/>
             <w:shd w:val="clear" w:color="auto" w:fill="1F3864"/>
           </w:tcPr>
           <w:p>
@@ -4914,7 +5265,7 @@
       <w:tr>
         <w:tc>
           <w:tcPr>
-            <w:tcW w:type="dxa" w:w="3628"/>
+            <w:tcW w:type="dxa" w:w="3742"/>
           </w:tcPr>
           <w:p>
             <w:pPr>
@@ -4924,13 +5275,13 @@
               <w:rPr>
                 <w:sz w:val="16"/>
               </w:rPr>
-              <w:t>1C dentro del target medio</w:t>
-            </w:r>
-          </w:p>
-        </w:tc>
-        <w:tc>
-          <w:tcPr>
-            <w:tcW w:type="dxa" w:w="2268"/>
+              <w:t>1C dentro del target (matriz Ecopetrol)</w:t>
+            </w:r>
+          </w:p>
+        </w:tc>
+        <w:tc>
+          <w:tcPr>
+            <w:tcW w:type="dxa" w:w="1928"/>
           </w:tcPr>
           <w:p>
             <w:pPr>
@@ -4940,13 +5291,13 @@
               <w:rPr>
                 <w:sz w:val="16"/>
               </w:rPr>
-              <w:t>B</w:t>
-            </w:r>
-          </w:p>
-        </w:tc>
-        <w:tc>
-          <w:tcPr>
-            <w:tcW w:type="dxa" w:w="2041"/>
+              <w:t>N</w:t>
+            </w:r>
+          </w:p>
+        </w:tc>
+        <w:tc>
+          <w:tcPr>
+            <w:tcW w:type="dxa" w:w="1871"/>
           </w:tcPr>
           <w:p>
             <w:pPr>
@@ -4962,7 +5313,7 @@
         </w:tc>
         <w:tc>
           <w:tcPr>
-            <w:tcW w:type="dxa" w:w="2551"/>
+            <w:tcW w:type="dxa" w:w="2948"/>
           </w:tcPr>
           <w:p>
             <w:pPr>
@@ -4980,7 +5331,7 @@
       <w:tr>
         <w:tc>
           <w:tcPr>
-            <w:tcW w:type="dxa" w:w="3628"/>
+            <w:tcW w:type="dxa" w:w="3742"/>
           </w:tcPr>
           <w:p>
             <w:pPr>
@@ -4990,13 +5341,13 @@
               <w:rPr>
                 <w:sz w:val="16"/>
               </w:rPr>
-              <w:t>3C = límite (PoF máx. 3)</w:t>
-            </w:r>
-          </w:p>
-        </w:tc>
-        <w:tc>
-          <w:tcPr>
-            <w:tcW w:type="dxa" w:w="2268"/>
+              <w:t>3C en la matriz Ecopetrol</w:t>
+            </w:r>
+          </w:p>
+        </w:tc>
+        <w:tc>
+          <w:tcPr>
+            <w:tcW w:type="dxa" w:w="1928"/>
           </w:tcPr>
           <w:p>
             <w:pPr>
@@ -5012,7 +5363,7 @@
         </w:tc>
         <w:tc>
           <w:tcPr>
-            <w:tcW w:type="dxa" w:w="2041"/>
+            <w:tcW w:type="dxa" w:w="1871"/>
           </w:tcPr>
           <w:p>
             <w:pPr>
@@ -5022,13 +5373,13 @@
               <w:rPr>
                 <w:sz w:val="16"/>
               </w:rPr>
-              <w:t>M</w:t>
-            </w:r>
-          </w:p>
-        </w:tc>
-        <w:tc>
-          <w:tcPr>
-            <w:tcW w:type="dxa" w:w="2551"/>
+              <w:t>M (límite)</w:t>
+            </w:r>
+          </w:p>
+        </w:tc>
+        <w:tc>
+          <w:tcPr>
+            <w:tcW w:type="dxa" w:w="2948"/>
           </w:tcPr>
           <w:p>
             <w:pPr>
@@ -5046,7 +5397,7 @@
       <w:tr>
         <w:tc>
           <w:tcPr>
-            <w:tcW w:type="dxa" w:w="3628"/>
+            <w:tcW w:type="dxa" w:w="3742"/>
           </w:tcPr>
           <w:p>
             <w:pPr>
@@ -5056,13 +5407,13 @@
               <w:rPr>
                 <w:sz w:val="16"/>
               </w:rPr>
-              <w:t>FC en categoría C</w:t>
-            </w:r>
-          </w:p>
-        </w:tc>
-        <w:tc>
-          <w:tcPr>
-            <w:tcW w:type="dxa" w:w="2268"/>
+              <w:t>4C: Ecopetrol M; matriz API del paper lo excede</w:t>
+            </w:r>
+          </w:p>
+        </w:tc>
+        <w:tc>
+          <w:tcPr>
+            <w:tcW w:type="dxa" w:w="1928"/>
           </w:tcPr>
           <w:p>
             <w:pPr>
@@ -5072,13 +5423,13 @@
               <w:rPr>
                 <w:sz w:val="16"/>
               </w:rPr>
-              <w:t>C</w:t>
-            </w:r>
-          </w:p>
-        </w:tc>
-        <w:tc>
-          <w:tcPr>
-            <w:tcW w:type="dxa" w:w="2041"/>
+              <w:t>M</w:t>
+            </w:r>
+          </w:p>
+        </w:tc>
+        <w:tc>
+          <w:tcPr>
+            <w:tcW w:type="dxa" w:w="1871"/>
           </w:tcPr>
           <w:p>
             <w:pPr>
@@ -5088,13 +5439,13 @@
               <w:rPr>
                 <w:sz w:val="16"/>
               </w:rPr>
-              <w:t>C</w:t>
-            </w:r>
-          </w:p>
-        </w:tc>
-        <w:tc>
-          <w:tcPr>
-            <w:tcW w:type="dxa" w:w="2551"/>
+              <w:t>excede</w:t>
+            </w:r>
+          </w:p>
+        </w:tc>
+        <w:tc>
+          <w:tcPr>
+            <w:tcW w:type="dxa" w:w="2948"/>
           </w:tcPr>
           <w:p>
             <w:pPr>
@@ -5104,7 +5455,7 @@
               <w:rPr>
                 <w:sz w:val="16"/>
               </w:rPr>
-              <w:t>OK</w:t>
+              <w:t>DIFERENCIA DE MATRIZ</w:t>
             </w:r>
           </w:p>
         </w:tc>
@@ -5112,7 +5463,7 @@
       <w:tr>
         <w:tc>
           <w:tcPr>
-            <w:tcW w:type="dxa" w:w="3628"/>
+            <w:tcW w:type="dxa" w:w="3742"/>
           </w:tcPr>
           <w:p>
             <w:pPr>
@@ -5122,13 +5473,13 @@
               <w:rPr>
                 <w:sz w:val="16"/>
               </w:rPr>
-              <w:t>6 h de paro = 10.000 $</w:t>
-            </w:r>
-          </w:p>
-        </w:tc>
-        <w:tc>
-          <w:tcPr>
-            <w:tcW w:type="dxa" w:w="2268"/>
+              <w:t>FC en categoría C</w:t>
+            </w:r>
+          </w:p>
+        </w:tc>
+        <w:tc>
+          <w:tcPr>
+            <w:tcW w:type="dxa" w:w="1928"/>
           </w:tcPr>
           <w:p>
             <w:pPr>
@@ -5138,13 +5489,13 @@
               <w:rPr>
                 <w:sz w:val="16"/>
               </w:rPr>
-              <w:t>10.000</w:t>
-            </w:r>
-          </w:p>
-        </w:tc>
-        <w:tc>
-          <w:tcPr>
-            <w:tcW w:type="dxa" w:w="2041"/>
+              <w:t>C</w:t>
+            </w:r>
+          </w:p>
+        </w:tc>
+        <w:tc>
+          <w:tcPr>
+            <w:tcW w:type="dxa" w:w="1871"/>
           </w:tcPr>
           <w:p>
             <w:pPr>
@@ -5154,13 +5505,13 @@
               <w:rPr>
                 <w:sz w:val="16"/>
               </w:rPr>
-              <w:t>10.000</w:t>
-            </w:r>
-          </w:p>
-        </w:tc>
-        <w:tc>
-          <w:tcPr>
-            <w:tcW w:type="dxa" w:w="2551"/>
+              <w:t>C</w:t>
+            </w:r>
+          </w:p>
+        </w:tc>
+        <w:tc>
+          <w:tcPr>
+            <w:tcW w:type="dxa" w:w="2948"/>
           </w:tcPr>
           <w:p>
             <w:pPr>
@@ -5178,7 +5529,7 @@
       <w:tr>
         <w:tc>
           <w:tcPr>
-            <w:tcW w:type="dxa" w:w="3628"/>
+            <w:tcW w:type="dxa" w:w="3742"/>
           </w:tcPr>
           <w:p>
             <w:pPr>
@@ -5188,13 +5539,13 @@
               <w:rPr>
                 <w:sz w:val="16"/>
               </w:rPr>
-              <w:t>TBI intrusiva / no intrusiva</w:t>
-            </w:r>
-          </w:p>
-        </w:tc>
-        <w:tc>
-          <w:tcPr>
-            <w:tcW w:type="dxa" w:w="2268"/>
+              <w:t>6 h de paro = 10.000 $</w:t>
+            </w:r>
+          </w:p>
+        </w:tc>
+        <w:tc>
+          <w:tcPr>
+            <w:tcW w:type="dxa" w:w="1928"/>
           </w:tcPr>
           <w:p>
             <w:pPr>
@@ -5204,13 +5555,13 @@
               <w:rPr>
                 <w:sz w:val="16"/>
               </w:rPr>
-              <w:t>43.360 / 3.840</w:t>
-            </w:r>
-          </w:p>
-        </w:tc>
-        <w:tc>
-          <w:tcPr>
-            <w:tcW w:type="dxa" w:w="2041"/>
+              <w:t>10.000</w:t>
+            </w:r>
+          </w:p>
+        </w:tc>
+        <w:tc>
+          <w:tcPr>
+            <w:tcW w:type="dxa" w:w="1871"/>
           </w:tcPr>
           <w:p>
             <w:pPr>
@@ -5220,13 +5571,13 @@
               <w:rPr>
                 <w:sz w:val="16"/>
               </w:rPr>
-              <w:t>43.360 / 3.840</w:t>
-            </w:r>
-          </w:p>
-        </w:tc>
-        <w:tc>
-          <w:tcPr>
-            <w:tcW w:type="dxa" w:w="2551"/>
+              <w:t>10.000</w:t>
+            </w:r>
+          </w:p>
+        </w:tc>
+        <w:tc>
+          <w:tcPr>
+            <w:tcW w:type="dxa" w:w="2948"/>
           </w:tcPr>
           <w:p>
             <w:pPr>
@@ -5244,7 +5595,7 @@
       <w:tr>
         <w:tc>
           <w:tcPr>
-            <w:tcW w:type="dxa" w:w="3628"/>
+            <w:tcW w:type="dxa" w:w="3742"/>
           </w:tcPr>
           <w:p>
             <w:pPr>
@@ -5254,13 +5605,13 @@
               <w:rPr>
                 <w:sz w:val="16"/>
               </w:rPr>
-              <w:t>RBI-1 intrusiva</w:t>
-            </w:r>
-          </w:p>
-        </w:tc>
-        <w:tc>
-          <w:tcPr>
-            <w:tcW w:type="dxa" w:w="2268"/>
+              <w:t>TBI intrusiva / no intrusiva</w:t>
+            </w:r>
+          </w:p>
+        </w:tc>
+        <w:tc>
+          <w:tcPr>
+            <w:tcW w:type="dxa" w:w="1928"/>
           </w:tcPr>
           <w:p>
             <w:pPr>
@@ -5270,13 +5621,13 @@
               <w:rPr>
                 <w:sz w:val="16"/>
               </w:rPr>
-              <w:t>11.650</w:t>
-            </w:r>
-          </w:p>
-        </w:tc>
-        <w:tc>
-          <w:tcPr>
-            <w:tcW w:type="dxa" w:w="2041"/>
+              <w:t>43.360 / 3.840</w:t>
+            </w:r>
+          </w:p>
+        </w:tc>
+        <w:tc>
+          <w:tcPr>
+            <w:tcW w:type="dxa" w:w="1871"/>
           </w:tcPr>
           <w:p>
             <w:pPr>
@@ -5286,13 +5637,13 @@
               <w:rPr>
                 <w:sz w:val="16"/>
               </w:rPr>
-              <w:t>11.650</w:t>
-            </w:r>
-          </w:p>
-        </w:tc>
-        <w:tc>
-          <w:tcPr>
-            <w:tcW w:type="dxa" w:w="2551"/>
+              <w:t>43.360 / 3.840</w:t>
+            </w:r>
+          </w:p>
+        </w:tc>
+        <w:tc>
+          <w:tcPr>
+            <w:tcW w:type="dxa" w:w="2948"/>
           </w:tcPr>
           <w:p>
             <w:pPr>
@@ -5310,7 +5661,7 @@
       <w:tr>
         <w:tc>
           <w:tcPr>
-            <w:tcW w:type="dxa" w:w="3628"/>
+            <w:tcW w:type="dxa" w:w="3742"/>
           </w:tcPr>
           <w:p>
             <w:pPr>
@@ -5320,13 +5671,13 @@
               <w:rPr>
                 <w:sz w:val="16"/>
               </w:rPr>
-              <w:t>RBI-2 intrusiva</w:t>
-            </w:r>
-          </w:p>
-        </w:tc>
-        <w:tc>
-          <w:tcPr>
-            <w:tcW w:type="dxa" w:w="2268"/>
+              <w:t>RBI-1 intrusiva</w:t>
+            </w:r>
+          </w:p>
+        </w:tc>
+        <w:tc>
+          <w:tcPr>
+            <w:tcW w:type="dxa" w:w="1928"/>
           </w:tcPr>
           <w:p>
             <w:pPr>
@@ -5336,13 +5687,13 @@
               <w:rPr>
                 <w:sz w:val="16"/>
               </w:rPr>
-              <w:t>1.410</w:t>
-            </w:r>
-          </w:p>
-        </w:tc>
-        <w:tc>
-          <w:tcPr>
-            <w:tcW w:type="dxa" w:w="2041"/>
+              <w:t>11.650</w:t>
+            </w:r>
+          </w:p>
+        </w:tc>
+        <w:tc>
+          <w:tcPr>
+            <w:tcW w:type="dxa" w:w="1871"/>
           </w:tcPr>
           <w:p>
             <w:pPr>
@@ -5352,13 +5703,13 @@
               <w:rPr>
                 <w:sz w:val="16"/>
               </w:rPr>
-              <w:t>1.170</w:t>
-            </w:r>
-          </w:p>
-        </w:tc>
-        <w:tc>
-          <w:tcPr>
-            <w:tcW w:type="dxa" w:w="2551"/>
+              <w:t>11.650</w:t>
+            </w:r>
+          </w:p>
+        </w:tc>
+        <w:tc>
+          <w:tcPr>
+            <w:tcW w:type="dxa" w:w="2948"/>
           </w:tcPr>
           <w:p>
             <w:pPr>
@@ -5368,7 +5719,7 @@
               <w:rPr>
                 <w:sz w:val="16"/>
               </w:rPr>
-              <w:t>INCONSISTENTE</w:t>
+              <w:t>OK</w:t>
             </w:r>
           </w:p>
         </w:tc>
@@ -5376,7 +5727,7 @@
       <w:tr>
         <w:tc>
           <w:tcPr>
-            <w:tcW w:type="dxa" w:w="3628"/>
+            <w:tcW w:type="dxa" w:w="3742"/>
           </w:tcPr>
           <w:p>
             <w:pPr>
@@ -5386,13 +5737,13 @@
               <w:rPr>
                 <w:sz w:val="16"/>
               </w:rPr>
-              <w:t>RBI-1 no intrusiva</w:t>
-            </w:r>
-          </w:p>
-        </w:tc>
-        <w:tc>
-          <w:tcPr>
-            <w:tcW w:type="dxa" w:w="2268"/>
+              <w:t>RBI-2 intrusiva</w:t>
+            </w:r>
+          </w:p>
+        </w:tc>
+        <w:tc>
+          <w:tcPr>
+            <w:tcW w:type="dxa" w:w="1928"/>
           </w:tcPr>
           <w:p>
             <w:pPr>
@@ -5402,13 +5753,13 @@
               <w:rPr>
                 <w:sz w:val="16"/>
               </w:rPr>
-              <w:t>2.010</w:t>
-            </w:r>
-          </w:p>
-        </w:tc>
-        <w:tc>
-          <w:tcPr>
-            <w:tcW w:type="dxa" w:w="2041"/>
+              <w:t>1.410</w:t>
+            </w:r>
+          </w:p>
+        </w:tc>
+        <w:tc>
+          <w:tcPr>
+            <w:tcW w:type="dxa" w:w="1871"/>
           </w:tcPr>
           <w:p>
             <w:pPr>
@@ -5418,13 +5769,13 @@
               <w:rPr>
                 <w:sz w:val="16"/>
               </w:rPr>
-              <w:t>1.080</w:t>
-            </w:r>
-          </w:p>
-        </w:tc>
-        <w:tc>
-          <w:tcPr>
-            <w:tcW w:type="dxa" w:w="2551"/>
+              <w:t>1.170</w:t>
+            </w:r>
+          </w:p>
+        </w:tc>
+        <w:tc>
+          <w:tcPr>
+            <w:tcW w:type="dxa" w:w="2948"/>
           </w:tcPr>
           <w:p>
             <w:pPr>
@@ -5442,7 +5793,7 @@
       <w:tr>
         <w:tc>
           <w:tcPr>
-            <w:tcW w:type="dxa" w:w="3628"/>
+            <w:tcW w:type="dxa" w:w="3742"/>
           </w:tcPr>
           <w:p>
             <w:pPr>
@@ -5452,13 +5803,13 @@
               <w:rPr>
                 <w:sz w:val="16"/>
               </w:rPr>
-              <w:t>Tasa de corrosión</w:t>
-            </w:r>
-          </w:p>
-        </w:tc>
-        <w:tc>
-          <w:tcPr>
-            <w:tcW w:type="dxa" w:w="2268"/>
+              <w:t>RBI-1 no intrusiva</w:t>
+            </w:r>
+          </w:p>
+        </w:tc>
+        <w:tc>
+          <w:tcPr>
+            <w:tcW w:type="dxa" w:w="1928"/>
           </w:tcPr>
           <w:p>
             <w:pPr>
@@ -5468,13 +5819,13 @@
               <w:rPr>
                 <w:sz w:val="16"/>
               </w:rPr>
-              <w:t>0,202</w:t>
-            </w:r>
-          </w:p>
-        </w:tc>
-        <w:tc>
-          <w:tcPr>
-            <w:tcW w:type="dxa" w:w="2041"/>
+              <w:t>2.010</w:t>
+            </w:r>
+          </w:p>
+        </w:tc>
+        <w:tc>
+          <w:tcPr>
+            <w:tcW w:type="dxa" w:w="1871"/>
           </w:tcPr>
           <w:p>
             <w:pPr>
@@ -5484,13 +5835,13 @@
               <w:rPr>
                 <w:sz w:val="16"/>
               </w:rPr>
-              <w:t>0,132</w:t>
-            </w:r>
-          </w:p>
-        </w:tc>
-        <w:tc>
-          <w:tcPr>
-            <w:tcW w:type="dxa" w:w="2551"/>
+              <w:t>1.080</w:t>
+            </w:r>
+          </w:p>
+        </w:tc>
+        <w:tc>
+          <w:tcPr>
+            <w:tcW w:type="dxa" w:w="2948"/>
           </w:tcPr>
           <w:p>
             <w:pPr>
@@ -5508,7 +5859,7 @@
       <w:tr>
         <w:tc>
           <w:tcPr>
-            <w:tcW w:type="dxa" w:w="3628"/>
+            <w:tcW w:type="dxa" w:w="3742"/>
           </w:tcPr>
           <w:p>
             <w:pPr>
@@ -5518,13 +5869,13 @@
               <w:rPr>
                 <w:sz w:val="16"/>
               </w:rPr>
-              <w:t>Df implícito A&lt;B&lt;C&lt;D (intervalos 23/17/12/9 a)</w:t>
-            </w:r>
-          </w:p>
-        </w:tc>
-        <w:tc>
-          <w:tcPr>
-            <w:tcW w:type="dxa" w:w="2268"/>
+              <w:t>Tasa de corrosión</w:t>
+            </w:r>
+          </w:p>
+        </w:tc>
+        <w:tc>
+          <w:tcPr>
+            <w:tcW w:type="dxa" w:w="1928"/>
           </w:tcPr>
           <w:p>
             <w:pPr>
@@ -5534,13 +5885,13 @@
               <w:rPr>
                 <w:sz w:val="16"/>
               </w:rPr>
-              <w:t>0,01&lt;0,09&lt;0,51&lt;1,4</w:t>
-            </w:r>
-          </w:p>
-        </w:tc>
-        <w:tc>
-          <w:tcPr>
-            <w:tcW w:type="dxa" w:w="2041"/>
+              <w:t>0,202</w:t>
+            </w:r>
+          </w:p>
+        </w:tc>
+        <w:tc>
+          <w:tcPr>
+            <w:tcW w:type="dxa" w:w="1871"/>
           </w:tcPr>
           <w:p>
             <w:pPr>
@@ -5550,13 +5901,13 @@
               <w:rPr>
                 <w:sz w:val="16"/>
               </w:rPr>
-              <w:t>Tabla 6</w:t>
-            </w:r>
-          </w:p>
-        </w:tc>
-        <w:tc>
-          <w:tcPr>
-            <w:tcW w:type="dxa" w:w="2551"/>
+              <w:t>0,132</w:t>
+            </w:r>
+          </w:p>
+        </w:tc>
+        <w:tc>
+          <w:tcPr>
+            <w:tcW w:type="dxa" w:w="2948"/>
           </w:tcPr>
           <w:p>
             <w:pPr>
@@ -5566,7 +5917,139 @@
               <w:rPr>
                 <w:sz w:val="16"/>
               </w:rPr>
-              <w:t>OK</w:t>
+              <w:t>INCONSISTENTE</w:t>
+            </w:r>
+          </w:p>
+        </w:tc>
+      </w:tr>
+      <w:tr>
+        <w:tc>
+          <w:tcPr>
+            <w:tcW w:type="dxa" w:w="3742"/>
+          </w:tcPr>
+          <w:p>
+            <w:pPr>
+              <w:spacing w:after="0"/>
+            </w:pPr>
+            <w:r>
+              <w:rPr>
+                <w:sz w:val="16"/>
+              </w:rPr>
+              <w:t>Motor Df (t_min 4 mm supuesto): Df 2023 → cat. 1</w:t>
+            </w:r>
+          </w:p>
+        </w:tc>
+        <w:tc>
+          <w:tcPr>
+            <w:tcW w:type="dxa" w:w="1928"/>
+          </w:tcPr>
+          <w:p>
+            <w:pPr>
+              <w:spacing w:after="0"/>
+            </w:pPr>
+            <w:r>
+              <w:rPr>
+                <w:sz w:val="16"/>
+              </w:rPr>
+              <w:t>0,7</w:t>
+            </w:r>
+          </w:p>
+        </w:tc>
+        <w:tc>
+          <w:tcPr>
+            <w:tcW w:type="dxa" w:w="1871"/>
+          </w:tcPr>
+          <w:p>
+            <w:pPr>
+              <w:spacing w:after="0"/>
+            </w:pPr>
+            <w:r>
+              <w:rPr>
+                <w:sz w:val="16"/>
+              </w:rPr>
+              <w:t>1C</w:t>
+            </w:r>
+          </w:p>
+        </w:tc>
+        <w:tc>
+          <w:tcPr>
+            <w:tcW w:type="dxa" w:w="2948"/>
+          </w:tcPr>
+          <w:p>
+            <w:pPr>
+              <w:spacing w:after="0"/>
+            </w:pPr>
+            <w:r>
+              <w:rPr>
+                <w:sz w:val="16"/>
+              </w:rPr>
+              <w:t>OK (parcial)</w:t>
+            </w:r>
+          </w:p>
+        </w:tc>
+      </w:tr>
+      <w:tr>
+        <w:tc>
+          <w:tcPr>
+            <w:tcW w:type="dxa" w:w="3742"/>
+          </w:tcPr>
+          <w:p>
+            <w:pPr>
+              <w:spacing w:after="0"/>
+            </w:pPr>
+            <w:r>
+              <w:rPr>
+                <w:sz w:val="16"/>
+              </w:rPr>
+              <w:t>Df CUI cruza 30 / 1.ª insp. CUI</w:t>
+            </w:r>
+          </w:p>
+        </w:tc>
+        <w:tc>
+          <w:tcPr>
+            <w:tcW w:type="dxa" w:w="1928"/>
+          </w:tcPr>
+          <w:p>
+            <w:pPr>
+              <w:spacing w:after="0"/>
+            </w:pPr>
+            <w:r>
+              <w:rPr>
+                <w:sz w:val="16"/>
+              </w:rPr>
+              <w:t>2028</w:t>
+            </w:r>
+          </w:p>
+        </w:tc>
+        <w:tc>
+          <w:tcPr>
+            <w:tcW w:type="dxa" w:w="1871"/>
+          </w:tcPr>
+          <w:p>
+            <w:pPr>
+              <w:spacing w:after="0"/>
+            </w:pPr>
+            <w:r>
+              <w:rPr>
+                <w:sz w:val="16"/>
+              </w:rPr>
+              <w:t>2032–2033</w:t>
+            </w:r>
+          </w:p>
+        </w:tc>
+        <w:tc>
+          <w:tcPr>
+            <w:tcW w:type="dxa" w:w="2948"/>
+          </w:tcPr>
+          <w:p>
+            <w:pPr>
+              <w:spacing w:after="0"/>
+            </w:pPr>
+            <w:r>
+              <w:rPr>
+                <w:sz w:val="16"/>
+              </w:rPr>
+              <w:t>DIFERENCIA (t_min, recubrimiento)</w:t>
             </w:r>
           </w:p>
         </w:tc>
@@ -5588,7 +6071,7 @@
           <w:color w:val="1F3864"/>
           <w:sz w:val="23"/>
         </w:rPr>
-        <w:t>8. Extrapolación a recipientes de Barrancabermeja (250.000 bbl/d y 52 unidades: datos suyos)</w:t>
+        <w:t>9. Extrapolación a recipientes de Barrancabermeja (250.000 bbl/d y 52 unidades: datos suyos)</w:t>
       </w:r>
     </w:p>
     <w:p>
@@ -5652,7 +6135,7 @@
           <w:color w:val="1F3864"/>
           <w:sz w:val="23"/>
         </w:rPr>
-        <w:t>9. Respuestas clave</w:t>
+        <w:t>10. Respuestas clave</w:t>
       </w:r>
     </w:p>
     <w:p>
@@ -5765,7 +6248,7 @@
           <w:color w:val="1F3864"/>
           <w:sz w:val="23"/>
         </w:rPr>
-        <w:t>10. Literatura para integrar el VAN (DOI)</w:t>
+        <w:t>11. Literatura para integrar el VAN (DOI)</w:t>
       </w:r>
     </w:p>
     <w:tbl>
@@ -6105,7 +6588,7 @@
           <w:color w:val="1F3864"/>
           <w:sz w:val="23"/>
         </w:rPr>
-        <w:t>11. Pendientes</w:t>
+        <w:t>12. Pendientes</w:t>
       </w:r>
     </w:p>
     <w:p>

</xml_diff>